<commit_message>
Update Module Two Shared AI Usage Report.docx
</commit_message>
<xml_diff>
--- a/Files (Module One and Two)/ModuleTwo-Specific Files/Module Two Shared AI Usage Report.docx
+++ b/Files (Module One and Two)/ModuleTwo-Specific Files/Module Two Shared AI Usage Report.docx
@@ -55,13 +55,7 @@
         <w:rPr>
           <w:rFonts w:ascii="Times New Roman" w:hAnsi="Times New Roman" w:cs="Times New Roman"/>
         </w:rPr>
-        <w:t>30 October</w:t>
-      </w:r>
-      <w:r>
-        <w:rPr>
-          <w:rFonts w:ascii="Times New Roman" w:hAnsi="Times New Roman" w:cs="Times New Roman"/>
-        </w:rPr>
-        <w:t xml:space="preserve"> 2026</w:t>
+        <w:t>30 October 2026</w:t>
       </w:r>
     </w:p>
     <w:p>
@@ -76,19 +70,7 @@
         <w:rPr>
           <w:rFonts w:ascii="Times New Roman" w:hAnsi="Times New Roman" w:cs="Times New Roman"/>
         </w:rPr>
-        <w:t xml:space="preserve">Module </w:t>
-      </w:r>
-      <w:r>
-        <w:rPr>
-          <w:rFonts w:ascii="Times New Roman" w:hAnsi="Times New Roman" w:cs="Times New Roman"/>
-        </w:rPr>
-        <w:t>Two</w:t>
-      </w:r>
-      <w:r>
-        <w:rPr>
-          <w:rFonts w:ascii="Times New Roman" w:hAnsi="Times New Roman" w:cs="Times New Roman"/>
-        </w:rPr>
-        <w:t xml:space="preserve"> AI Usage Report</w:t>
+        <w:t>Module Two AI Usage Report</w:t>
       </w:r>
     </w:p>
     <w:p>
@@ -112,6 +94,12 @@
         </w:rPr>
         <w:t xml:space="preserve"> </w:t>
       </w:r>
+      <w:r>
+        <w:rPr>
+          <w:rFonts w:ascii="Times New Roman" w:hAnsi="Times New Roman" w:cs="Times New Roman"/>
+        </w:rPr>
+        <w:t>ChatGPT</w:t>
+      </w:r>
     </w:p>
     <w:p>
       <w:pPr>
@@ -134,6 +122,12 @@
         </w:rPr>
         <w:t xml:space="preserve"> </w:t>
       </w:r>
+      <w:r>
+        <w:rPr>
+          <w:rFonts w:ascii="Times New Roman" w:hAnsi="Times New Roman" w:cs="Times New Roman"/>
+        </w:rPr>
+        <w:t>Organizing initial script(s)</w:t>
+      </w:r>
     </w:p>
     <w:p>
       <w:pPr>
@@ -156,6 +150,12 @@
         </w:rPr>
         <w:t xml:space="preserve"> </w:t>
       </w:r>
+      <w:r>
+        <w:rPr>
+          <w:rFonts w:ascii="Times New Roman" w:hAnsi="Times New Roman" w:cs="Times New Roman"/>
+        </w:rPr>
+        <w:t>validation.js</w:t>
+      </w:r>
     </w:p>
     <w:p>
       <w:pPr>
@@ -178,6 +178,24 @@
         </w:rPr>
         <w:t xml:space="preserve"> </w:t>
       </w:r>
+      <w:r>
+        <w:rPr>
+          <w:rFonts w:ascii="Times New Roman" w:hAnsi="Times New Roman" w:cs="Times New Roman"/>
+        </w:rPr>
+        <w:t xml:space="preserve">I want to do all validation in JavaScript. I first want to make the fields that my professor says are required, required, and then I will move on to specific rules. Is it better to have one script for each form we have, or one overarching </w:t>
+      </w:r>
+      <w:r>
+        <w:rPr>
+          <w:rFonts w:ascii="Times New Roman" w:hAnsi="Times New Roman" w:cs="Times New Roman"/>
+        </w:rPr>
+        <w:t>script</w:t>
+      </w:r>
+      <w:r>
+        <w:rPr>
+          <w:rFonts w:ascii="Times New Roman" w:hAnsi="Times New Roman" w:cs="Times New Roman"/>
+        </w:rPr>
+        <w:t>?</w:t>
+      </w:r>
     </w:p>
     <w:p>
       <w:pPr>
@@ -200,6 +218,54 @@
         </w:rPr>
         <w:t xml:space="preserve"> </w:t>
       </w:r>
+      <w:r>
+        <w:rPr>
+          <w:rFonts w:ascii="Times New Roman" w:hAnsi="Times New Roman" w:cs="Times New Roman"/>
+        </w:rPr>
+        <w:t xml:space="preserve">It would make sense to only use one </w:t>
+      </w:r>
+      <w:r>
+        <w:rPr>
+          <w:rFonts w:ascii="Times New Roman" w:hAnsi="Times New Roman" w:cs="Times New Roman"/>
+        </w:rPr>
+        <w:t>script but</w:t>
+      </w:r>
+      <w:r>
+        <w:rPr>
+          <w:rFonts w:ascii="Times New Roman" w:hAnsi="Times New Roman" w:cs="Times New Roman"/>
+        </w:rPr>
+        <w:t xml:space="preserve"> organize </w:t>
+      </w:r>
+      <w:r>
+        <w:rPr>
+          <w:rFonts w:ascii="Times New Roman" w:hAnsi="Times New Roman" w:cs="Times New Roman"/>
+        </w:rPr>
+        <w:t>it</w:t>
+      </w:r>
+      <w:r>
+        <w:rPr>
+          <w:rFonts w:ascii="Times New Roman" w:hAnsi="Times New Roman" w:cs="Times New Roman"/>
+        </w:rPr>
+        <w:t xml:space="preserve"> so each form has a section. Start by </w:t>
+      </w:r>
+      <w:r>
+        <w:rPr>
+          <w:rFonts w:ascii="Times New Roman" w:hAnsi="Times New Roman" w:cs="Times New Roman"/>
+        </w:rPr>
+        <w:t>creating constants to store each form (check the document for them</w:t>
+      </w:r>
+      <w:r>
+        <w:rPr>
+          <w:rFonts w:ascii="Times New Roman" w:hAnsi="Times New Roman" w:cs="Times New Roman"/>
+        </w:rPr>
+        <w:t>) and</w:t>
+      </w:r>
+      <w:r>
+        <w:rPr>
+          <w:rFonts w:ascii="Times New Roman" w:hAnsi="Times New Roman" w:cs="Times New Roman"/>
+        </w:rPr>
+        <w:t xml:space="preserve"> then create if statements for each form. The if statements will help ensure that validation logic only gets executed if the related form is currently on the page.</w:t>
+      </w:r>
     </w:p>
     <w:p>
       <w:pPr>
@@ -224,6 +290,1504 @@
         </w:rPr>
         <w:t xml:space="preserve"> </w:t>
       </w:r>
+      <w:r>
+        <w:rPr>
+          <w:rFonts w:ascii="Times New Roman" w:hAnsi="Times New Roman" w:cs="Times New Roman"/>
+        </w:rPr>
+        <w:t xml:space="preserve">I used this response to create the structure of my </w:t>
+      </w:r>
+      <w:r>
+        <w:rPr>
+          <w:rFonts w:ascii="Times New Roman" w:hAnsi="Times New Roman" w:cs="Times New Roman"/>
+        </w:rPr>
+        <w:t>JavaScript code and develop a plan of attack.</w:t>
+      </w:r>
+    </w:p>
+    <w:p>
+      <w:pPr>
+        <w:rPr>
+          <w:rFonts w:ascii="Times New Roman" w:hAnsi="Times New Roman" w:cs="Times New Roman"/>
+          <w:b/>
+          <w:bCs/>
+        </w:rPr>
+      </w:pPr>
+      <w:r>
+        <w:rPr>
+          <w:rFonts w:ascii="Times New Roman" w:hAnsi="Times New Roman" w:cs="Times New Roman"/>
+          <w:b/>
+          <w:bCs/>
+        </w:rPr>
+        <w:br w:type="page"/>
+      </w:r>
+    </w:p>
+    <w:p>
+      <w:pPr>
+        <w:spacing w:line="480" w:lineRule="auto"/>
+        <w:rPr>
+          <w:rFonts w:ascii="Times New Roman" w:hAnsi="Times New Roman" w:cs="Times New Roman"/>
+        </w:rPr>
+      </w:pPr>
+      <w:r>
+        <w:rPr>
+          <w:rFonts w:ascii="Times New Roman" w:hAnsi="Times New Roman" w:cs="Times New Roman"/>
+          <w:b/>
+          <w:bCs/>
+        </w:rPr>
+        <w:lastRenderedPageBreak/>
+        <w:t>AI Tool used:</w:t>
+      </w:r>
+      <w:r>
+        <w:rPr>
+          <w:rFonts w:ascii="Times New Roman" w:hAnsi="Times New Roman" w:cs="Times New Roman"/>
+        </w:rPr>
+        <w:t xml:space="preserve"> </w:t>
+      </w:r>
+      <w:r>
+        <w:rPr>
+          <w:rFonts w:ascii="Times New Roman" w:hAnsi="Times New Roman" w:cs="Times New Roman"/>
+        </w:rPr>
+        <w:t>ChatGPT</w:t>
+      </w:r>
+    </w:p>
+    <w:p>
+      <w:pPr>
+        <w:spacing w:line="480" w:lineRule="auto"/>
+        <w:rPr>
+          <w:rFonts w:ascii="Times New Roman" w:hAnsi="Times New Roman" w:cs="Times New Roman"/>
+        </w:rPr>
+      </w:pPr>
+      <w:r>
+        <w:rPr>
+          <w:rFonts w:ascii="Times New Roman" w:hAnsi="Times New Roman" w:cs="Times New Roman"/>
+          <w:b/>
+          <w:bCs/>
+        </w:rPr>
+        <w:t>Task being performed:</w:t>
+      </w:r>
+      <w:r>
+        <w:rPr>
+          <w:rFonts w:ascii="Times New Roman" w:hAnsi="Times New Roman" w:cs="Times New Roman"/>
+        </w:rPr>
+        <w:t xml:space="preserve"> </w:t>
+      </w:r>
+      <w:r>
+        <w:rPr>
+          <w:rFonts w:ascii="Times New Roman" w:hAnsi="Times New Roman" w:cs="Times New Roman"/>
+        </w:rPr>
+        <w:t xml:space="preserve">Confirm validation is working </w:t>
+      </w:r>
+    </w:p>
+    <w:p>
+      <w:pPr>
+        <w:spacing w:line="480" w:lineRule="auto"/>
+        <w:rPr>
+          <w:rFonts w:ascii="Times New Roman" w:hAnsi="Times New Roman" w:cs="Times New Roman"/>
+        </w:rPr>
+      </w:pPr>
+      <w:r>
+        <w:rPr>
+          <w:rFonts w:ascii="Times New Roman" w:hAnsi="Times New Roman" w:cs="Times New Roman"/>
+          <w:b/>
+          <w:bCs/>
+        </w:rPr>
+        <w:t>File associated with task:</w:t>
+      </w:r>
+      <w:r>
+        <w:rPr>
+          <w:rFonts w:ascii="Times New Roman" w:hAnsi="Times New Roman" w:cs="Times New Roman"/>
+        </w:rPr>
+        <w:t xml:space="preserve"> </w:t>
+      </w:r>
+      <w:r>
+        <w:rPr>
+          <w:rFonts w:ascii="Times New Roman" w:hAnsi="Times New Roman" w:cs="Times New Roman"/>
+        </w:rPr>
+        <w:t>validation.js</w:t>
+      </w:r>
+    </w:p>
+    <w:p>
+      <w:pPr>
+        <w:spacing w:line="480" w:lineRule="auto"/>
+        <w:rPr>
+          <w:rFonts w:ascii="Times New Roman" w:hAnsi="Times New Roman" w:cs="Times New Roman"/>
+        </w:rPr>
+      </w:pPr>
+      <w:r>
+        <w:rPr>
+          <w:rFonts w:ascii="Times New Roman" w:hAnsi="Times New Roman" w:cs="Times New Roman"/>
+          <w:b/>
+          <w:bCs/>
+        </w:rPr>
+        <w:t>Prompt/question provided:</w:t>
+      </w:r>
+      <w:r>
+        <w:rPr>
+          <w:rFonts w:ascii="Times New Roman" w:hAnsi="Times New Roman" w:cs="Times New Roman"/>
+        </w:rPr>
+        <w:t xml:space="preserve"> </w:t>
+      </w:r>
+      <w:r>
+        <w:rPr>
+          <w:rFonts w:ascii="Times New Roman" w:hAnsi="Times New Roman" w:cs="Times New Roman"/>
+        </w:rPr>
+        <w:t>my form doesn't "submit" anywhere yet, which is intentional. What can I do to still check the validation?</w:t>
+      </w:r>
+    </w:p>
+    <w:p>
+      <w:pPr>
+        <w:spacing w:line="480" w:lineRule="auto"/>
+        <w:rPr>
+          <w:rFonts w:ascii="Times New Roman" w:hAnsi="Times New Roman" w:cs="Times New Roman"/>
+        </w:rPr>
+      </w:pPr>
+      <w:r>
+        <w:rPr>
+          <w:rFonts w:ascii="Times New Roman" w:hAnsi="Times New Roman" w:cs="Times New Roman"/>
+          <w:b/>
+          <w:bCs/>
+        </w:rPr>
+        <w:t>Summary of the response:</w:t>
+      </w:r>
+      <w:r>
+        <w:rPr>
+          <w:rFonts w:ascii="Times New Roman" w:hAnsi="Times New Roman" w:cs="Times New Roman"/>
+        </w:rPr>
+        <w:t xml:space="preserve"> </w:t>
+      </w:r>
+      <w:r>
+        <w:rPr>
+          <w:rFonts w:ascii="Times New Roman" w:hAnsi="Times New Roman" w:cs="Times New Roman"/>
+        </w:rPr>
+        <w:t xml:space="preserve">Use console.log() statements and </w:t>
+      </w:r>
+      <w:proofErr w:type="spellStart"/>
+      <w:r>
+        <w:rPr>
+          <w:rFonts w:ascii="Times New Roman" w:hAnsi="Times New Roman" w:cs="Times New Roman"/>
+        </w:rPr>
+        <w:t>e.preventDefault</w:t>
+      </w:r>
+      <w:proofErr w:type="spellEnd"/>
+      <w:r>
+        <w:rPr>
+          <w:rFonts w:ascii="Times New Roman" w:hAnsi="Times New Roman" w:cs="Times New Roman"/>
+        </w:rPr>
+        <w:t>() to simulate a submission.</w:t>
+      </w:r>
+    </w:p>
+    <w:p>
+      <w:pPr>
+        <w:spacing w:line="480" w:lineRule="auto"/>
+        <w:rPr>
+          <w:rFonts w:ascii="Times New Roman" w:hAnsi="Times New Roman" w:cs="Times New Roman"/>
+          <w:b/>
+          <w:bCs/>
+        </w:rPr>
+      </w:pPr>
+      <w:r>
+        <w:rPr>
+          <w:rFonts w:ascii="Times New Roman" w:hAnsi="Times New Roman" w:cs="Times New Roman"/>
+          <w:b/>
+          <w:bCs/>
+        </w:rPr>
+        <w:t>How was the response used (directly, modified, discarded)? Explain.</w:t>
+      </w:r>
+      <w:r>
+        <w:rPr>
+          <w:rFonts w:ascii="Times New Roman" w:hAnsi="Times New Roman" w:cs="Times New Roman"/>
+          <w:b/>
+          <w:bCs/>
+        </w:rPr>
+        <w:t xml:space="preserve"> </w:t>
+      </w:r>
+      <w:r>
+        <w:rPr>
+          <w:rFonts w:ascii="Times New Roman" w:hAnsi="Times New Roman" w:cs="Times New Roman"/>
+        </w:rPr>
+        <w:t>I added in console.log() statements to every validation check in the add course logic.</w:t>
+      </w:r>
+    </w:p>
+    <w:p>
+      <w:pPr>
+        <w:rPr>
+          <w:rFonts w:ascii="Times New Roman" w:hAnsi="Times New Roman" w:cs="Times New Roman"/>
+          <w:b/>
+          <w:bCs/>
+        </w:rPr>
+      </w:pPr>
+      <w:r>
+        <w:rPr>
+          <w:rFonts w:ascii="Times New Roman" w:hAnsi="Times New Roman" w:cs="Times New Roman"/>
+          <w:b/>
+          <w:bCs/>
+        </w:rPr>
+        <w:br w:type="page"/>
+      </w:r>
+    </w:p>
+    <w:p>
+      <w:pPr>
+        <w:spacing w:line="480" w:lineRule="auto"/>
+        <w:rPr>
+          <w:rFonts w:ascii="Times New Roman" w:hAnsi="Times New Roman" w:cs="Times New Roman"/>
+        </w:rPr>
+      </w:pPr>
+      <w:r>
+        <w:rPr>
+          <w:rFonts w:ascii="Times New Roman" w:hAnsi="Times New Roman" w:cs="Times New Roman"/>
+          <w:b/>
+          <w:bCs/>
+        </w:rPr>
+        <w:lastRenderedPageBreak/>
+        <w:t>AI Tool used:</w:t>
+      </w:r>
+      <w:r>
+        <w:rPr>
+          <w:rFonts w:ascii="Times New Roman" w:hAnsi="Times New Roman" w:cs="Times New Roman"/>
+        </w:rPr>
+        <w:t xml:space="preserve"> </w:t>
+      </w:r>
+      <w:r>
+        <w:rPr>
+          <w:rFonts w:ascii="Times New Roman" w:hAnsi="Times New Roman" w:cs="Times New Roman"/>
+        </w:rPr>
+        <w:t>ChatGPT</w:t>
+      </w:r>
+    </w:p>
+    <w:p>
+      <w:pPr>
+        <w:spacing w:line="480" w:lineRule="auto"/>
+        <w:rPr>
+          <w:rFonts w:ascii="Times New Roman" w:hAnsi="Times New Roman" w:cs="Times New Roman"/>
+        </w:rPr>
+      </w:pPr>
+      <w:r>
+        <w:rPr>
+          <w:rFonts w:ascii="Times New Roman" w:hAnsi="Times New Roman" w:cs="Times New Roman"/>
+          <w:b/>
+          <w:bCs/>
+        </w:rPr>
+        <w:t>Task being performed:</w:t>
+      </w:r>
+      <w:r>
+        <w:rPr>
+          <w:rFonts w:ascii="Times New Roman" w:hAnsi="Times New Roman" w:cs="Times New Roman"/>
+        </w:rPr>
+        <w:t xml:space="preserve"> </w:t>
+      </w:r>
+      <w:r>
+        <w:rPr>
+          <w:rFonts w:ascii="Times New Roman" w:hAnsi="Times New Roman" w:cs="Times New Roman"/>
+        </w:rPr>
+        <w:t xml:space="preserve">Understanding format of </w:t>
+      </w:r>
+      <w:proofErr w:type="spellStart"/>
+      <w:r>
+        <w:rPr>
+          <w:rFonts w:ascii="Times New Roman" w:hAnsi="Times New Roman" w:cs="Times New Roman"/>
+        </w:rPr>
+        <w:t>RegEx</w:t>
+      </w:r>
+      <w:proofErr w:type="spellEnd"/>
+      <w:r>
+        <w:rPr>
+          <w:rFonts w:ascii="Times New Roman" w:hAnsi="Times New Roman" w:cs="Times New Roman"/>
+        </w:rPr>
+        <w:t xml:space="preserve"> checks in JavaScript</w:t>
+      </w:r>
+    </w:p>
+    <w:p>
+      <w:pPr>
+        <w:spacing w:line="480" w:lineRule="auto"/>
+        <w:rPr>
+          <w:rFonts w:ascii="Times New Roman" w:hAnsi="Times New Roman" w:cs="Times New Roman"/>
+        </w:rPr>
+      </w:pPr>
+      <w:r>
+        <w:rPr>
+          <w:rFonts w:ascii="Times New Roman" w:hAnsi="Times New Roman" w:cs="Times New Roman"/>
+          <w:b/>
+          <w:bCs/>
+        </w:rPr>
+        <w:t>File associated with task:</w:t>
+      </w:r>
+      <w:r>
+        <w:rPr>
+          <w:rFonts w:ascii="Times New Roman" w:hAnsi="Times New Roman" w:cs="Times New Roman"/>
+        </w:rPr>
+        <w:t xml:space="preserve"> </w:t>
+      </w:r>
+      <w:r>
+        <w:rPr>
+          <w:rFonts w:ascii="Times New Roman" w:hAnsi="Times New Roman" w:cs="Times New Roman"/>
+        </w:rPr>
+        <w:t>validation.js</w:t>
+      </w:r>
+    </w:p>
+    <w:p>
+      <w:pPr>
+        <w:spacing w:line="480" w:lineRule="auto"/>
+        <w:rPr>
+          <w:rFonts w:ascii="Times New Roman" w:hAnsi="Times New Roman" w:cs="Times New Roman"/>
+        </w:rPr>
+      </w:pPr>
+      <w:r>
+        <w:rPr>
+          <w:rFonts w:ascii="Times New Roman" w:hAnsi="Times New Roman" w:cs="Times New Roman"/>
+          <w:b/>
+          <w:bCs/>
+        </w:rPr>
+        <w:t>Prompt/question provided:</w:t>
+      </w:r>
+      <w:r>
+        <w:rPr>
+          <w:rFonts w:ascii="Times New Roman" w:hAnsi="Times New Roman" w:cs="Times New Roman"/>
+        </w:rPr>
+        <w:t xml:space="preserve"> </w:t>
+      </w:r>
+      <w:r>
+        <w:rPr>
+          <w:rFonts w:ascii="Times New Roman" w:hAnsi="Times New Roman" w:cs="Times New Roman"/>
+        </w:rPr>
+        <w:t xml:space="preserve">Help me understand the general format of doing a </w:t>
+      </w:r>
+      <w:proofErr w:type="spellStart"/>
+      <w:r>
+        <w:rPr>
+          <w:rFonts w:ascii="Times New Roman" w:hAnsi="Times New Roman" w:cs="Times New Roman"/>
+        </w:rPr>
+        <w:t>RegEx</w:t>
+      </w:r>
+      <w:proofErr w:type="spellEnd"/>
+      <w:r>
+        <w:rPr>
+          <w:rFonts w:ascii="Times New Roman" w:hAnsi="Times New Roman" w:cs="Times New Roman"/>
+        </w:rPr>
+        <w:t xml:space="preserve"> comparison in JavaScript</w:t>
+      </w:r>
+    </w:p>
+    <w:p>
+      <w:pPr>
+        <w:spacing w:line="480" w:lineRule="auto"/>
+        <w:rPr>
+          <w:rFonts w:ascii="Times New Roman" w:hAnsi="Times New Roman" w:cs="Times New Roman"/>
+        </w:rPr>
+      </w:pPr>
+      <w:r>
+        <w:rPr>
+          <w:rFonts w:ascii="Times New Roman" w:hAnsi="Times New Roman" w:cs="Times New Roman"/>
+          <w:b/>
+          <w:bCs/>
+        </w:rPr>
+        <w:t>Summary of the response:</w:t>
+      </w:r>
+      <w:r>
+        <w:rPr>
+          <w:rFonts w:ascii="Times New Roman" w:hAnsi="Times New Roman" w:cs="Times New Roman"/>
+        </w:rPr>
+        <w:t xml:space="preserve"> </w:t>
+      </w:r>
+      <w:r>
+        <w:rPr>
+          <w:rFonts w:ascii="Times New Roman" w:hAnsi="Times New Roman" w:cs="Times New Roman"/>
+        </w:rPr>
+        <w:t>There are two common methods for checking</w:t>
+      </w:r>
+      <w:r>
+        <w:rPr>
+          <w:rFonts w:ascii="Times New Roman" w:hAnsi="Times New Roman" w:cs="Times New Roman"/>
+        </w:rPr>
+        <w:t xml:space="preserve"> </w:t>
+      </w:r>
+      <w:proofErr w:type="spellStart"/>
+      <w:r>
+        <w:rPr>
+          <w:rFonts w:ascii="Times New Roman" w:hAnsi="Times New Roman" w:cs="Times New Roman"/>
+        </w:rPr>
+        <w:t>RegEx</w:t>
+      </w:r>
+      <w:proofErr w:type="spellEnd"/>
+      <w:r>
+        <w:rPr>
+          <w:rFonts w:ascii="Times New Roman" w:hAnsi="Times New Roman" w:cs="Times New Roman"/>
+        </w:rPr>
+        <w:t xml:space="preserve">: using test() and using match(). </w:t>
+      </w:r>
+      <w:r>
+        <w:rPr>
+          <w:rFonts w:ascii="Times New Roman" w:hAnsi="Times New Roman" w:cs="Times New Roman"/>
+        </w:rPr>
+        <w:t>The test() method is usually simpler since it returns a Boolean</w:t>
+      </w:r>
+      <w:r>
+        <w:rPr>
+          <w:rFonts w:ascii="Times New Roman" w:hAnsi="Times New Roman" w:cs="Times New Roman"/>
+        </w:rPr>
+        <w:t xml:space="preserve">. </w:t>
+      </w:r>
+    </w:p>
+    <w:p>
+      <w:pPr>
+        <w:spacing w:line="480" w:lineRule="auto"/>
+        <w:rPr>
+          <w:rFonts w:ascii="Times New Roman" w:hAnsi="Times New Roman" w:cs="Times New Roman"/>
+        </w:rPr>
+      </w:pPr>
+      <w:r>
+        <w:rPr>
+          <w:rFonts w:ascii="Times New Roman" w:hAnsi="Times New Roman" w:cs="Times New Roman"/>
+          <w:b/>
+          <w:bCs/>
+        </w:rPr>
+        <w:t>How was the response used (directly, modified, discarded)? Explain.</w:t>
+      </w:r>
+      <w:r>
+        <w:rPr>
+          <w:rFonts w:ascii="Times New Roman" w:hAnsi="Times New Roman" w:cs="Times New Roman"/>
+          <w:b/>
+          <w:bCs/>
+        </w:rPr>
+        <w:t xml:space="preserve"> </w:t>
+      </w:r>
+      <w:r>
+        <w:rPr>
+          <w:rFonts w:ascii="Times New Roman" w:hAnsi="Times New Roman" w:cs="Times New Roman"/>
+        </w:rPr>
+        <w:t xml:space="preserve">I used the test() method within if statements to check if the inputted value for a field matched the </w:t>
+      </w:r>
+      <w:proofErr w:type="spellStart"/>
+      <w:r>
+        <w:rPr>
+          <w:rFonts w:ascii="Times New Roman" w:hAnsi="Times New Roman" w:cs="Times New Roman"/>
+        </w:rPr>
+        <w:t>RegEx</w:t>
+      </w:r>
+      <w:proofErr w:type="spellEnd"/>
+      <w:r>
+        <w:rPr>
+          <w:rFonts w:ascii="Times New Roman" w:hAnsi="Times New Roman" w:cs="Times New Roman"/>
+        </w:rPr>
+        <w:t xml:space="preserve"> pattern I defined.</w:t>
+      </w:r>
+    </w:p>
+    <w:p>
+      <w:pPr>
+        <w:rPr>
+          <w:rFonts w:ascii="Times New Roman" w:hAnsi="Times New Roman" w:cs="Times New Roman"/>
+          <w:b/>
+          <w:bCs/>
+        </w:rPr>
+      </w:pPr>
+      <w:r>
+        <w:rPr>
+          <w:rFonts w:ascii="Times New Roman" w:hAnsi="Times New Roman" w:cs="Times New Roman"/>
+          <w:b/>
+          <w:bCs/>
+        </w:rPr>
+        <w:br w:type="page"/>
+      </w:r>
+    </w:p>
+    <w:p>
+      <w:pPr>
+        <w:spacing w:line="480" w:lineRule="auto"/>
+        <w:rPr>
+          <w:rFonts w:ascii="Times New Roman" w:hAnsi="Times New Roman" w:cs="Times New Roman"/>
+        </w:rPr>
+      </w:pPr>
+      <w:r>
+        <w:rPr>
+          <w:rFonts w:ascii="Times New Roman" w:hAnsi="Times New Roman" w:cs="Times New Roman"/>
+          <w:b/>
+          <w:bCs/>
+        </w:rPr>
+        <w:lastRenderedPageBreak/>
+        <w:t>AI Tool used:</w:t>
+      </w:r>
+      <w:r>
+        <w:rPr>
+          <w:rFonts w:ascii="Times New Roman" w:hAnsi="Times New Roman" w:cs="Times New Roman"/>
+        </w:rPr>
+        <w:t xml:space="preserve"> ChatGPT</w:t>
+      </w:r>
+    </w:p>
+    <w:p>
+      <w:pPr>
+        <w:spacing w:line="480" w:lineRule="auto"/>
+        <w:rPr>
+          <w:rFonts w:ascii="Times New Roman" w:hAnsi="Times New Roman" w:cs="Times New Roman"/>
+        </w:rPr>
+      </w:pPr>
+      <w:r>
+        <w:rPr>
+          <w:rFonts w:ascii="Times New Roman" w:hAnsi="Times New Roman" w:cs="Times New Roman"/>
+          <w:b/>
+          <w:bCs/>
+        </w:rPr>
+        <w:t>Task being performed:</w:t>
+      </w:r>
+      <w:r>
+        <w:rPr>
+          <w:rFonts w:ascii="Times New Roman" w:hAnsi="Times New Roman" w:cs="Times New Roman"/>
+        </w:rPr>
+        <w:t xml:space="preserve"> </w:t>
+      </w:r>
+      <w:r>
+        <w:rPr>
+          <w:rFonts w:ascii="Times New Roman" w:hAnsi="Times New Roman" w:cs="Times New Roman"/>
+        </w:rPr>
+        <w:t xml:space="preserve">Understand </w:t>
+      </w:r>
+      <w:proofErr w:type="spellStart"/>
+      <w:r>
+        <w:rPr>
+          <w:rFonts w:ascii="Times New Roman" w:hAnsi="Times New Roman" w:cs="Times New Roman"/>
+        </w:rPr>
+        <w:t>RegEx</w:t>
+      </w:r>
+      <w:proofErr w:type="spellEnd"/>
+    </w:p>
+    <w:p>
+      <w:pPr>
+        <w:spacing w:line="480" w:lineRule="auto"/>
+        <w:rPr>
+          <w:rFonts w:ascii="Times New Roman" w:hAnsi="Times New Roman" w:cs="Times New Roman"/>
+        </w:rPr>
+      </w:pPr>
+      <w:r>
+        <w:rPr>
+          <w:rFonts w:ascii="Times New Roman" w:hAnsi="Times New Roman" w:cs="Times New Roman"/>
+          <w:b/>
+          <w:bCs/>
+        </w:rPr>
+        <w:t>File associated with task:</w:t>
+      </w:r>
+      <w:r>
+        <w:rPr>
+          <w:rFonts w:ascii="Times New Roman" w:hAnsi="Times New Roman" w:cs="Times New Roman"/>
+        </w:rPr>
+        <w:t xml:space="preserve"> validation.js</w:t>
+      </w:r>
+    </w:p>
+    <w:p>
+      <w:pPr>
+        <w:spacing w:line="480" w:lineRule="auto"/>
+        <w:rPr>
+          <w:rFonts w:ascii="Times New Roman" w:hAnsi="Times New Roman" w:cs="Times New Roman"/>
+        </w:rPr>
+      </w:pPr>
+      <w:r>
+        <w:rPr>
+          <w:rFonts w:ascii="Times New Roman" w:hAnsi="Times New Roman" w:cs="Times New Roman"/>
+          <w:b/>
+          <w:bCs/>
+        </w:rPr>
+        <w:t>Prompt/question provided:</w:t>
+      </w:r>
+      <w:r>
+        <w:rPr>
+          <w:rFonts w:ascii="Times New Roman" w:hAnsi="Times New Roman" w:cs="Times New Roman"/>
+        </w:rPr>
+        <w:t xml:space="preserve"> </w:t>
+      </w:r>
+      <w:r>
+        <w:rPr>
+          <w:rFonts w:ascii="Times New Roman" w:hAnsi="Times New Roman" w:cs="Times New Roman"/>
+        </w:rPr>
+        <w:t>He</w:t>
+      </w:r>
+      <w:r>
+        <w:rPr>
+          <w:rFonts w:ascii="Times New Roman" w:hAnsi="Times New Roman" w:cs="Times New Roman"/>
+        </w:rPr>
+        <w:t xml:space="preserve">lp me correct this </w:t>
+      </w:r>
+      <w:proofErr w:type="spellStart"/>
+      <w:r>
+        <w:rPr>
+          <w:rFonts w:ascii="Times New Roman" w:hAnsi="Times New Roman" w:cs="Times New Roman"/>
+        </w:rPr>
+        <w:t>RegEx</w:t>
+      </w:r>
+      <w:proofErr w:type="spellEnd"/>
+      <w:r>
+        <w:rPr>
+          <w:rFonts w:ascii="Times New Roman" w:hAnsi="Times New Roman" w:cs="Times New Roman"/>
+        </w:rPr>
+        <w:t xml:space="preserve"> expression (help me adjust my thinking so I can conceptualize these better moving forward). It is supposed to ensure that the input is exactly 4 digits and is no less than "2026". This was my attempt at the </w:t>
+      </w:r>
+      <w:proofErr w:type="spellStart"/>
+      <w:r>
+        <w:rPr>
+          <w:rFonts w:ascii="Times New Roman" w:hAnsi="Times New Roman" w:cs="Times New Roman"/>
+        </w:rPr>
+        <w:t>RegEx</w:t>
+      </w:r>
+      <w:proofErr w:type="spellEnd"/>
+      <w:r>
+        <w:rPr>
+          <w:rFonts w:ascii="Times New Roman" w:hAnsi="Times New Roman" w:cs="Times New Roman"/>
+        </w:rPr>
+        <w:t>: '2[0-9][2-9][0-9]{4}'</w:t>
+      </w:r>
+    </w:p>
+    <w:p>
+      <w:pPr>
+        <w:spacing w:line="480" w:lineRule="auto"/>
+        <w:rPr>
+          <w:rFonts w:ascii="Times New Roman" w:hAnsi="Times New Roman" w:cs="Times New Roman"/>
+        </w:rPr>
+      </w:pPr>
+      <w:r>
+        <w:rPr>
+          <w:rFonts w:ascii="Times New Roman" w:hAnsi="Times New Roman" w:cs="Times New Roman"/>
+          <w:b/>
+          <w:bCs/>
+        </w:rPr>
+        <w:t>Summary of the response:</w:t>
+      </w:r>
+      <w:r>
+        <w:rPr>
+          <w:rFonts w:ascii="Times New Roman" w:hAnsi="Times New Roman" w:cs="Times New Roman"/>
+        </w:rPr>
+        <w:t xml:space="preserve"> </w:t>
+      </w:r>
+      <w:r>
+        <w:rPr>
+          <w:rFonts w:ascii="Times New Roman" w:hAnsi="Times New Roman" w:cs="Times New Roman"/>
+        </w:rPr>
+        <w:t xml:space="preserve">It is better to think of these types of </w:t>
+      </w:r>
+      <w:proofErr w:type="spellStart"/>
+      <w:r>
+        <w:rPr>
+          <w:rFonts w:ascii="Times New Roman" w:hAnsi="Times New Roman" w:cs="Times New Roman"/>
+        </w:rPr>
+        <w:t>RegEx</w:t>
+      </w:r>
+      <w:proofErr w:type="spellEnd"/>
+      <w:r>
+        <w:rPr>
+          <w:rFonts w:ascii="Times New Roman" w:hAnsi="Times New Roman" w:cs="Times New Roman"/>
+        </w:rPr>
+        <w:t xml:space="preserve"> as possible patterns. For example, if the first value </w:t>
+      </w:r>
+      <w:r>
+        <w:rPr>
+          <w:rFonts w:ascii="Times New Roman" w:hAnsi="Times New Roman" w:cs="Times New Roman"/>
+        </w:rPr>
+        <w:t>of the year is greater than 2, it shouldn’t matter what the next 3 digits are. If the first value of the year is 2, but the second value is greater than 0, the next two digits also do not matter.</w:t>
+      </w:r>
+    </w:p>
+    <w:p>
+      <w:pPr>
+        <w:spacing w:line="480" w:lineRule="auto"/>
+        <w:rPr>
+          <w:rFonts w:ascii="Times New Roman" w:hAnsi="Times New Roman" w:cs="Times New Roman"/>
+        </w:rPr>
+      </w:pPr>
+      <w:r>
+        <w:rPr>
+          <w:rFonts w:ascii="Times New Roman" w:hAnsi="Times New Roman" w:cs="Times New Roman"/>
+          <w:b/>
+          <w:bCs/>
+        </w:rPr>
+        <w:t>How was the response used (directly, modified, discarded)? Explain.</w:t>
+      </w:r>
+      <w:r>
+        <w:rPr>
+          <w:rFonts w:ascii="Times New Roman" w:hAnsi="Times New Roman" w:cs="Times New Roman"/>
+          <w:b/>
+          <w:bCs/>
+        </w:rPr>
+        <w:t xml:space="preserve"> </w:t>
+      </w:r>
+      <w:r>
+        <w:rPr>
+          <w:rFonts w:ascii="Times New Roman" w:hAnsi="Times New Roman" w:cs="Times New Roman"/>
+        </w:rPr>
+        <w:t>I used this response to help me think about the patterns I should use to verify the input for the year. It helped me understand that I can use the | (or symbol) to do multiple different options for patterns.</w:t>
+      </w:r>
+    </w:p>
+    <w:p>
+      <w:pPr>
+        <w:rPr>
+          <w:rFonts w:ascii="Times New Roman" w:hAnsi="Times New Roman" w:cs="Times New Roman"/>
+          <w:b/>
+          <w:bCs/>
+        </w:rPr>
+      </w:pPr>
+      <w:r>
+        <w:rPr>
+          <w:rFonts w:ascii="Times New Roman" w:hAnsi="Times New Roman" w:cs="Times New Roman"/>
+          <w:b/>
+          <w:bCs/>
+        </w:rPr>
+        <w:br w:type="page"/>
+      </w:r>
+    </w:p>
+    <w:p>
+      <w:pPr>
+        <w:spacing w:line="480" w:lineRule="auto"/>
+        <w:rPr>
+          <w:rFonts w:ascii="Times New Roman" w:hAnsi="Times New Roman" w:cs="Times New Roman"/>
+        </w:rPr>
+      </w:pPr>
+      <w:r>
+        <w:rPr>
+          <w:rFonts w:ascii="Times New Roman" w:hAnsi="Times New Roman" w:cs="Times New Roman"/>
+          <w:b/>
+          <w:bCs/>
+        </w:rPr>
+        <w:lastRenderedPageBreak/>
+        <w:t>AI Tool used:</w:t>
+      </w:r>
+      <w:r>
+        <w:rPr>
+          <w:rFonts w:ascii="Times New Roman" w:hAnsi="Times New Roman" w:cs="Times New Roman"/>
+        </w:rPr>
+        <w:t xml:space="preserve"> ChatGPT</w:t>
+      </w:r>
+    </w:p>
+    <w:p>
+      <w:pPr>
+        <w:spacing w:line="480" w:lineRule="auto"/>
+        <w:rPr>
+          <w:rFonts w:ascii="Times New Roman" w:hAnsi="Times New Roman" w:cs="Times New Roman"/>
+        </w:rPr>
+      </w:pPr>
+      <w:r>
+        <w:rPr>
+          <w:rFonts w:ascii="Times New Roman" w:hAnsi="Times New Roman" w:cs="Times New Roman"/>
+          <w:b/>
+          <w:bCs/>
+        </w:rPr>
+        <w:t>Task being performed:</w:t>
+      </w:r>
+      <w:r>
+        <w:rPr>
+          <w:rFonts w:ascii="Times New Roman" w:hAnsi="Times New Roman" w:cs="Times New Roman"/>
+        </w:rPr>
+        <w:t xml:space="preserve"> </w:t>
+      </w:r>
+      <w:r>
+        <w:rPr>
+          <w:rFonts w:ascii="Times New Roman" w:hAnsi="Times New Roman" w:cs="Times New Roman"/>
+        </w:rPr>
+        <w:t>Help organizing sections</w:t>
+      </w:r>
+    </w:p>
+    <w:p>
+      <w:pPr>
+        <w:spacing w:line="480" w:lineRule="auto"/>
+        <w:rPr>
+          <w:rFonts w:ascii="Times New Roman" w:hAnsi="Times New Roman" w:cs="Times New Roman"/>
+        </w:rPr>
+      </w:pPr>
+      <w:r>
+        <w:rPr>
+          <w:rFonts w:ascii="Times New Roman" w:hAnsi="Times New Roman" w:cs="Times New Roman"/>
+          <w:b/>
+          <w:bCs/>
+        </w:rPr>
+        <w:t>File associated with task:</w:t>
+      </w:r>
+      <w:r>
+        <w:rPr>
+          <w:rFonts w:ascii="Times New Roman" w:hAnsi="Times New Roman" w:cs="Times New Roman"/>
+        </w:rPr>
+        <w:t xml:space="preserve"> validation.js</w:t>
+      </w:r>
+    </w:p>
+    <w:p>
+      <w:pPr>
+        <w:spacing w:line="480" w:lineRule="auto"/>
+        <w:rPr>
+          <w:rFonts w:ascii="Times New Roman" w:hAnsi="Times New Roman" w:cs="Times New Roman"/>
+          <w:b/>
+          <w:bCs/>
+        </w:rPr>
+      </w:pPr>
+      <w:r>
+        <w:rPr>
+          <w:rFonts w:ascii="Times New Roman" w:hAnsi="Times New Roman" w:cs="Times New Roman"/>
+          <w:b/>
+          <w:bCs/>
+        </w:rPr>
+        <w:t>Prompt/question provided:</w:t>
+      </w:r>
+      <w:r>
+        <w:rPr>
+          <w:rFonts w:ascii="Times New Roman" w:hAnsi="Times New Roman" w:cs="Times New Roman"/>
+        </w:rPr>
+        <w:t xml:space="preserve"> </w:t>
+      </w:r>
+      <w:r>
+        <w:rPr>
+          <w:rFonts w:ascii="Times New Roman" w:hAnsi="Times New Roman" w:cs="Times New Roman"/>
+        </w:rPr>
+        <w:t>O</w:t>
+      </w:r>
+      <w:r>
+        <w:rPr>
+          <w:rFonts w:ascii="Times New Roman" w:hAnsi="Times New Roman" w:cs="Times New Roman"/>
+        </w:rPr>
+        <w:t>verall, is there a better way to organize these validation rules for each form? I currently have the following set up (only one input field is validated/meets project requirements, there will be 9 total fields I have to "confirm" for this form, some of which I have sections for via comments):</w:t>
+      </w:r>
+    </w:p>
+    <w:p>
+      <w:pPr>
+        <w:spacing w:line="480" w:lineRule="auto"/>
+        <w:rPr>
+          <w:rFonts w:ascii="Times New Roman" w:hAnsi="Times New Roman" w:cs="Times New Roman"/>
+        </w:rPr>
+      </w:pPr>
+      <w:r>
+        <w:rPr>
+          <w:rFonts w:ascii="Times New Roman" w:hAnsi="Times New Roman" w:cs="Times New Roman"/>
+          <w:b/>
+          <w:bCs/>
+        </w:rPr>
+        <w:t>Summary of the response:</w:t>
+      </w:r>
+      <w:r>
+        <w:rPr>
+          <w:rFonts w:ascii="Times New Roman" w:hAnsi="Times New Roman" w:cs="Times New Roman"/>
+        </w:rPr>
+        <w:t xml:space="preserve"> </w:t>
+      </w:r>
+      <w:r>
+        <w:rPr>
+          <w:rFonts w:ascii="Times New Roman" w:hAnsi="Times New Roman" w:cs="Times New Roman"/>
+        </w:rPr>
+        <w:t xml:space="preserve">Use a Boolean to track if the form is valid or not to avoid repetitive code. </w:t>
+      </w:r>
+      <w:r>
+        <w:rPr>
+          <w:rFonts w:ascii="Times New Roman" w:hAnsi="Times New Roman" w:cs="Times New Roman"/>
+        </w:rPr>
+        <w:t>This will allow errors to be reported for multiple fields at once.</w:t>
+      </w:r>
+    </w:p>
+    <w:p>
+      <w:pPr>
+        <w:spacing w:line="480" w:lineRule="auto"/>
+        <w:rPr>
+          <w:rFonts w:ascii="Times New Roman" w:hAnsi="Times New Roman" w:cs="Times New Roman"/>
+        </w:rPr>
+      </w:pPr>
+      <w:r>
+        <w:rPr>
+          <w:rFonts w:ascii="Times New Roman" w:hAnsi="Times New Roman" w:cs="Times New Roman"/>
+          <w:b/>
+          <w:bCs/>
+        </w:rPr>
+        <w:t>How was the response used (directly, modified, discarded)? Explain.</w:t>
+      </w:r>
+      <w:r>
+        <w:rPr>
+          <w:rFonts w:ascii="Times New Roman" w:hAnsi="Times New Roman" w:cs="Times New Roman"/>
+          <w:b/>
+          <w:bCs/>
+        </w:rPr>
+        <w:t xml:space="preserve"> </w:t>
+      </w:r>
+      <w:r>
+        <w:rPr>
+          <w:rFonts w:ascii="Times New Roman" w:hAnsi="Times New Roman" w:cs="Times New Roman"/>
+        </w:rPr>
+        <w:t xml:space="preserve">I included a Boolean variable at the beginning of my </w:t>
+      </w:r>
+      <w:proofErr w:type="spellStart"/>
+      <w:r>
+        <w:rPr>
+          <w:rFonts w:ascii="Times New Roman" w:hAnsi="Times New Roman" w:cs="Times New Roman"/>
+        </w:rPr>
+        <w:t>addCourse</w:t>
+      </w:r>
+      <w:proofErr w:type="spellEnd"/>
+      <w:r>
+        <w:rPr>
+          <w:rFonts w:ascii="Times New Roman" w:hAnsi="Times New Roman" w:cs="Times New Roman"/>
+        </w:rPr>
+        <w:t xml:space="preserve"> validation </w:t>
+      </w:r>
+      <w:r>
+        <w:rPr>
+          <w:rFonts w:ascii="Times New Roman" w:hAnsi="Times New Roman" w:cs="Times New Roman"/>
+        </w:rPr>
+        <w:t>and adjusted the logic throughout my code to use this variable. If the form becomes invalid</w:t>
+      </w:r>
+      <w:r>
+        <w:rPr>
+          <w:rFonts w:ascii="Times New Roman" w:hAnsi="Times New Roman" w:cs="Times New Roman"/>
+        </w:rPr>
+        <w:t xml:space="preserve"> (either a required field isn’t entered </w:t>
+      </w:r>
+      <w:r>
+        <w:rPr>
+          <w:rFonts w:ascii="Times New Roman" w:hAnsi="Times New Roman" w:cs="Times New Roman"/>
+        </w:rPr>
+        <w:t xml:space="preserve">or the input doesn’t match the </w:t>
+      </w:r>
+      <w:proofErr w:type="spellStart"/>
+      <w:r>
+        <w:rPr>
+          <w:rFonts w:ascii="Times New Roman" w:hAnsi="Times New Roman" w:cs="Times New Roman"/>
+        </w:rPr>
+        <w:t>RegEx</w:t>
+      </w:r>
+      <w:proofErr w:type="spellEnd"/>
+      <w:r>
+        <w:rPr>
+          <w:rFonts w:ascii="Times New Roman" w:hAnsi="Times New Roman" w:cs="Times New Roman"/>
+        </w:rPr>
+        <w:t>), the submission is prevented. If the Boolean never gets changed to false, then logic for a valid submission is executed.</w:t>
+      </w:r>
+    </w:p>
+    <w:p>
+      <w:pPr>
+        <w:rPr>
+          <w:rFonts w:ascii="Times New Roman" w:hAnsi="Times New Roman" w:cs="Times New Roman"/>
+          <w:b/>
+          <w:bCs/>
+        </w:rPr>
+      </w:pPr>
+      <w:r>
+        <w:rPr>
+          <w:rFonts w:ascii="Times New Roman" w:hAnsi="Times New Roman" w:cs="Times New Roman"/>
+          <w:b/>
+          <w:bCs/>
+        </w:rPr>
+        <w:br w:type="page"/>
+      </w:r>
+    </w:p>
+    <w:p>
+      <w:pPr>
+        <w:spacing w:line="480" w:lineRule="auto"/>
+        <w:rPr>
+          <w:rFonts w:ascii="Times New Roman" w:hAnsi="Times New Roman" w:cs="Times New Roman"/>
+        </w:rPr>
+      </w:pPr>
+      <w:r>
+        <w:rPr>
+          <w:rFonts w:ascii="Times New Roman" w:hAnsi="Times New Roman" w:cs="Times New Roman"/>
+          <w:b/>
+          <w:bCs/>
+        </w:rPr>
+        <w:lastRenderedPageBreak/>
+        <w:t>AI Tool used:</w:t>
+      </w:r>
+      <w:r>
+        <w:rPr>
+          <w:rFonts w:ascii="Times New Roman" w:hAnsi="Times New Roman" w:cs="Times New Roman"/>
+        </w:rPr>
+        <w:t xml:space="preserve"> ChatGPT</w:t>
+      </w:r>
+    </w:p>
+    <w:p>
+      <w:pPr>
+        <w:spacing w:line="480" w:lineRule="auto"/>
+        <w:rPr>
+          <w:rFonts w:ascii="Times New Roman" w:hAnsi="Times New Roman" w:cs="Times New Roman"/>
+        </w:rPr>
+      </w:pPr>
+      <w:r>
+        <w:rPr>
+          <w:rFonts w:ascii="Times New Roman" w:hAnsi="Times New Roman" w:cs="Times New Roman"/>
+          <w:b/>
+          <w:bCs/>
+        </w:rPr>
+        <w:t>Task being performed:</w:t>
+      </w:r>
+      <w:r>
+        <w:rPr>
+          <w:rFonts w:ascii="Times New Roman" w:hAnsi="Times New Roman" w:cs="Times New Roman"/>
+        </w:rPr>
+        <w:t xml:space="preserve"> </w:t>
+      </w:r>
+      <w:r>
+        <w:rPr>
+          <w:rFonts w:ascii="Times New Roman" w:hAnsi="Times New Roman" w:cs="Times New Roman"/>
+        </w:rPr>
+        <w:t xml:space="preserve">Edit </w:t>
+      </w:r>
+      <w:proofErr w:type="spellStart"/>
+      <w:r>
+        <w:rPr>
+          <w:rFonts w:ascii="Times New Roman" w:hAnsi="Times New Roman" w:cs="Times New Roman"/>
+        </w:rPr>
+        <w:t>RegEx</w:t>
+      </w:r>
+      <w:proofErr w:type="spellEnd"/>
+      <w:r>
+        <w:rPr>
+          <w:rFonts w:ascii="Times New Roman" w:hAnsi="Times New Roman" w:cs="Times New Roman"/>
+        </w:rPr>
+        <w:t xml:space="preserve"> expression</w:t>
+      </w:r>
+    </w:p>
+    <w:p>
+      <w:pPr>
+        <w:spacing w:line="480" w:lineRule="auto"/>
+        <w:rPr>
+          <w:rFonts w:ascii="Times New Roman" w:hAnsi="Times New Roman" w:cs="Times New Roman"/>
+        </w:rPr>
+      </w:pPr>
+      <w:r>
+        <w:rPr>
+          <w:rFonts w:ascii="Times New Roman" w:hAnsi="Times New Roman" w:cs="Times New Roman"/>
+          <w:b/>
+          <w:bCs/>
+        </w:rPr>
+        <w:t>File associated with task:</w:t>
+      </w:r>
+      <w:r>
+        <w:rPr>
+          <w:rFonts w:ascii="Times New Roman" w:hAnsi="Times New Roman" w:cs="Times New Roman"/>
+        </w:rPr>
+        <w:t xml:space="preserve"> validation.js</w:t>
+      </w:r>
+    </w:p>
+    <w:p>
+      <w:pPr>
+        <w:spacing w:line="480" w:lineRule="auto"/>
+        <w:rPr>
+          <w:rFonts w:ascii="Times New Roman" w:hAnsi="Times New Roman" w:cs="Times New Roman"/>
+        </w:rPr>
+      </w:pPr>
+      <w:r>
+        <w:rPr>
+          <w:rFonts w:ascii="Times New Roman" w:hAnsi="Times New Roman" w:cs="Times New Roman"/>
+          <w:b/>
+          <w:bCs/>
+        </w:rPr>
+        <w:t>Prompt/question provided:</w:t>
+      </w:r>
+      <w:r>
+        <w:rPr>
+          <w:rFonts w:ascii="Times New Roman" w:hAnsi="Times New Roman" w:cs="Times New Roman"/>
+        </w:rPr>
+        <w:t xml:space="preserve"> </w:t>
+      </w:r>
+      <w:r>
+        <w:rPr>
+          <w:rFonts w:ascii="Times New Roman" w:hAnsi="Times New Roman" w:cs="Times New Roman"/>
+        </w:rPr>
+        <w:t xml:space="preserve">Help me edit this </w:t>
+      </w:r>
+      <w:proofErr w:type="spellStart"/>
+      <w:r>
+        <w:rPr>
+          <w:rFonts w:ascii="Times New Roman" w:hAnsi="Times New Roman" w:cs="Times New Roman"/>
+        </w:rPr>
+        <w:t>RegEx</w:t>
+      </w:r>
+      <w:proofErr w:type="spellEnd"/>
+      <w:r>
+        <w:rPr>
+          <w:rFonts w:ascii="Times New Roman" w:hAnsi="Times New Roman" w:cs="Times New Roman"/>
+        </w:rPr>
+        <w:t xml:space="preserve"> expression (</w:t>
+      </w:r>
+      <w:r>
+        <w:rPr>
+          <w:rFonts w:ascii="Times New Roman" w:hAnsi="Times New Roman" w:cs="Times New Roman"/>
+          <w:b/>
+          <w:bCs/>
+        </w:rPr>
+        <w:t>const</w:t>
+      </w:r>
+      <w:r>
+        <w:rPr>
+          <w:rFonts w:ascii="Times New Roman" w:hAnsi="Times New Roman" w:cs="Times New Roman"/>
+        </w:rPr>
+        <w:t xml:space="preserve"> </w:t>
+      </w:r>
+      <w:proofErr w:type="spellStart"/>
+      <w:r>
+        <w:rPr>
+          <w:rFonts w:ascii="Times New Roman" w:hAnsi="Times New Roman" w:cs="Times New Roman"/>
+        </w:rPr>
+        <w:t>roomRegEx</w:t>
+      </w:r>
+      <w:proofErr w:type="spellEnd"/>
+      <w:r>
+        <w:rPr>
+          <w:rFonts w:ascii="Times New Roman" w:hAnsi="Times New Roman" w:cs="Times New Roman"/>
+        </w:rPr>
+        <w:t xml:space="preserve"> = /^[A-Za-z'\s]\d[0-9]{2,3}\s{0,1}[a-</w:t>
+      </w:r>
+      <w:proofErr w:type="spellStart"/>
+      <w:r>
+        <w:rPr>
+          <w:rFonts w:ascii="Times New Roman" w:hAnsi="Times New Roman" w:cs="Times New Roman"/>
+        </w:rPr>
+        <w:t>zA</w:t>
+      </w:r>
+      <w:proofErr w:type="spellEnd"/>
+      <w:r>
+        <w:rPr>
+          <w:rFonts w:ascii="Times New Roman" w:hAnsi="Times New Roman" w:cs="Times New Roman"/>
+        </w:rPr>
+        <w:t>-z]{0,1}$/;) to fit this description: Must be formatted as a building name and room number. The building name will be a string</w:t>
+      </w:r>
+      <w:r>
+        <w:rPr>
+          <w:rFonts w:ascii="Times New Roman" w:hAnsi="Times New Roman" w:cs="Times New Roman"/>
+        </w:rPr>
+        <w:br/>
+        <w:t>that can have spaces and/or apostrophes. The room number can be 2 or 3 digits, and it may</w:t>
+      </w:r>
+      <w:r>
+        <w:rPr>
+          <w:rFonts w:ascii="Times New Roman" w:hAnsi="Times New Roman" w:cs="Times New Roman"/>
+        </w:rPr>
+        <w:br/>
+        <w:t>end with a letter.</w:t>
+      </w:r>
+    </w:p>
+    <w:p>
+      <w:pPr>
+        <w:spacing w:line="480" w:lineRule="auto"/>
+        <w:rPr>
+          <w:rFonts w:ascii="Times New Roman" w:hAnsi="Times New Roman" w:cs="Times New Roman"/>
+        </w:rPr>
+      </w:pPr>
+      <w:r>
+        <w:rPr>
+          <w:rFonts w:ascii="Times New Roman" w:hAnsi="Times New Roman" w:cs="Times New Roman"/>
+          <w:b/>
+          <w:bCs/>
+        </w:rPr>
+        <w:t>Summary of the response:</w:t>
+      </w:r>
+      <w:r>
+        <w:rPr>
+          <w:rFonts w:ascii="Times New Roman" w:hAnsi="Times New Roman" w:cs="Times New Roman"/>
+        </w:rPr>
+        <w:t xml:space="preserve"> </w:t>
+      </w:r>
+      <w:r>
+        <w:rPr>
+          <w:rFonts w:ascii="Times New Roman" w:hAnsi="Times New Roman" w:cs="Times New Roman"/>
+        </w:rPr>
+        <w:t xml:space="preserve">I was given an updated </w:t>
+      </w:r>
+      <w:proofErr w:type="spellStart"/>
+      <w:r>
+        <w:rPr>
+          <w:rFonts w:ascii="Times New Roman" w:hAnsi="Times New Roman" w:cs="Times New Roman"/>
+        </w:rPr>
+        <w:t>RegEx</w:t>
+      </w:r>
+      <w:proofErr w:type="spellEnd"/>
+      <w:r>
+        <w:rPr>
+          <w:rFonts w:ascii="Times New Roman" w:hAnsi="Times New Roman" w:cs="Times New Roman"/>
+        </w:rPr>
+        <w:t xml:space="preserve"> and a description of each part of the statement.</w:t>
+      </w:r>
+    </w:p>
+    <w:p>
+      <w:pPr>
+        <w:spacing w:line="480" w:lineRule="auto"/>
+        <w:rPr>
+          <w:rFonts w:ascii="Times New Roman" w:hAnsi="Times New Roman" w:cs="Times New Roman"/>
+        </w:rPr>
+      </w:pPr>
+      <w:r>
+        <w:rPr>
+          <w:rFonts w:ascii="Times New Roman" w:hAnsi="Times New Roman" w:cs="Times New Roman"/>
+          <w:b/>
+          <w:bCs/>
+        </w:rPr>
+        <w:t>How was the response used (directly, modified, discarded)? Explain.</w:t>
+      </w:r>
+      <w:r>
+        <w:rPr>
+          <w:rFonts w:ascii="Times New Roman" w:hAnsi="Times New Roman" w:cs="Times New Roman"/>
+          <w:b/>
+          <w:bCs/>
+        </w:rPr>
+        <w:t xml:space="preserve"> </w:t>
+      </w:r>
+      <w:r>
+        <w:rPr>
+          <w:rFonts w:ascii="Times New Roman" w:hAnsi="Times New Roman" w:cs="Times New Roman"/>
+        </w:rPr>
+        <w:t>I evaluated this expression against mine and made adjustments as needed</w:t>
+      </w:r>
+      <w:r>
+        <w:rPr>
+          <w:rFonts w:ascii="Times New Roman" w:hAnsi="Times New Roman" w:cs="Times New Roman"/>
+        </w:rPr>
+        <w:t xml:space="preserve"> before putting it into my code.</w:t>
+      </w:r>
+    </w:p>
+    <w:p>
+      <w:pPr>
+        <w:rPr>
+          <w:rFonts w:ascii="Times New Roman" w:hAnsi="Times New Roman" w:cs="Times New Roman"/>
+        </w:rPr>
+      </w:pPr>
+      <w:r>
+        <w:rPr>
+          <w:rFonts w:ascii="Times New Roman" w:hAnsi="Times New Roman" w:cs="Times New Roman"/>
+        </w:rPr>
+        <w:br w:type="page"/>
+      </w:r>
+    </w:p>
+    <w:p>
+      <w:pPr>
+        <w:spacing w:line="480" w:lineRule="auto"/>
+        <w:rPr>
+          <w:rFonts w:ascii="Times New Roman" w:hAnsi="Times New Roman" w:cs="Times New Roman"/>
+        </w:rPr>
+      </w:pPr>
+      <w:r>
+        <w:rPr>
+          <w:rFonts w:ascii="Times New Roman" w:hAnsi="Times New Roman" w:cs="Times New Roman"/>
+          <w:b/>
+          <w:bCs/>
+        </w:rPr>
+        <w:lastRenderedPageBreak/>
+        <w:t>AI Tool used:</w:t>
+      </w:r>
+      <w:r>
+        <w:rPr>
+          <w:rFonts w:ascii="Times New Roman" w:hAnsi="Times New Roman" w:cs="Times New Roman"/>
+        </w:rPr>
+        <w:t xml:space="preserve"> ChatGPT</w:t>
+      </w:r>
+    </w:p>
+    <w:p>
+      <w:pPr>
+        <w:spacing w:line="480" w:lineRule="auto"/>
+        <w:rPr>
+          <w:rFonts w:ascii="Times New Roman" w:hAnsi="Times New Roman" w:cs="Times New Roman"/>
+        </w:rPr>
+      </w:pPr>
+      <w:r>
+        <w:rPr>
+          <w:rFonts w:ascii="Times New Roman" w:hAnsi="Times New Roman" w:cs="Times New Roman"/>
+          <w:b/>
+          <w:bCs/>
+        </w:rPr>
+        <w:t>Task being performed:</w:t>
+      </w:r>
+      <w:r>
+        <w:rPr>
+          <w:rFonts w:ascii="Times New Roman" w:hAnsi="Times New Roman" w:cs="Times New Roman"/>
+        </w:rPr>
+        <w:t xml:space="preserve"> </w:t>
+      </w:r>
+      <w:r>
+        <w:rPr>
+          <w:rFonts w:ascii="Times New Roman" w:hAnsi="Times New Roman" w:cs="Times New Roman"/>
+        </w:rPr>
+        <w:t>Display alert with submitted fields</w:t>
+      </w:r>
+    </w:p>
+    <w:p>
+      <w:pPr>
+        <w:spacing w:line="480" w:lineRule="auto"/>
+        <w:rPr>
+          <w:rFonts w:ascii="Times New Roman" w:hAnsi="Times New Roman" w:cs="Times New Roman"/>
+        </w:rPr>
+      </w:pPr>
+      <w:r>
+        <w:rPr>
+          <w:rFonts w:ascii="Times New Roman" w:hAnsi="Times New Roman" w:cs="Times New Roman"/>
+          <w:b/>
+          <w:bCs/>
+        </w:rPr>
+        <w:t>File associated with task:</w:t>
+      </w:r>
+      <w:r>
+        <w:rPr>
+          <w:rFonts w:ascii="Times New Roman" w:hAnsi="Times New Roman" w:cs="Times New Roman"/>
+        </w:rPr>
+        <w:t xml:space="preserve"> validation.js</w:t>
+      </w:r>
+    </w:p>
+    <w:p>
+      <w:pPr>
+        <w:spacing w:line="480" w:lineRule="auto"/>
+        <w:rPr>
+          <w:rFonts w:ascii="Times New Roman" w:hAnsi="Times New Roman" w:cs="Times New Roman"/>
+        </w:rPr>
+      </w:pPr>
+      <w:r>
+        <w:rPr>
+          <w:rFonts w:ascii="Times New Roman" w:hAnsi="Times New Roman" w:cs="Times New Roman"/>
+          <w:b/>
+          <w:bCs/>
+        </w:rPr>
+        <w:t>Prompt/question provided:</w:t>
+      </w:r>
+      <w:r>
+        <w:rPr>
+          <w:rFonts w:ascii="Times New Roman" w:hAnsi="Times New Roman" w:cs="Times New Roman"/>
+        </w:rPr>
+        <w:t xml:space="preserve"> </w:t>
+      </w:r>
+      <w:r>
+        <w:rPr>
+          <w:rFonts w:ascii="Times New Roman" w:hAnsi="Times New Roman" w:cs="Times New Roman"/>
+        </w:rPr>
+        <w:t>How can I display a pop-up box in JavaScript? I want to print back the information entered by the user once they submit (and all fields meet requirements). Don't give code yet for the text display, just help me get started with the pop-up box</w:t>
+      </w:r>
+    </w:p>
+    <w:p>
+      <w:pPr>
+        <w:spacing w:line="480" w:lineRule="auto"/>
+        <w:rPr>
+          <w:rFonts w:ascii="Times New Roman" w:hAnsi="Times New Roman" w:cs="Times New Roman"/>
+        </w:rPr>
+      </w:pPr>
+      <w:r>
+        <w:rPr>
+          <w:rFonts w:ascii="Times New Roman" w:hAnsi="Times New Roman" w:cs="Times New Roman"/>
+          <w:b/>
+          <w:bCs/>
+        </w:rPr>
+        <w:t>Summary of the response</w:t>
+      </w:r>
+      <w:r>
+        <w:rPr>
+          <w:rFonts w:ascii="Times New Roman" w:hAnsi="Times New Roman" w:cs="Times New Roman"/>
+          <w:b/>
+          <w:bCs/>
+        </w:rPr>
+        <w:t xml:space="preserve">: </w:t>
+      </w:r>
+      <w:r>
+        <w:rPr>
+          <w:rFonts w:ascii="Times New Roman" w:hAnsi="Times New Roman" w:cs="Times New Roman"/>
+        </w:rPr>
+        <w:t>There are three main</w:t>
+      </w:r>
+      <w:r>
+        <w:rPr>
+          <w:rFonts w:ascii="Times New Roman" w:hAnsi="Times New Roman" w:cs="Times New Roman"/>
+        </w:rPr>
+        <w:t xml:space="preserve"> ways that </w:t>
+      </w:r>
+      <w:r>
+        <w:rPr>
+          <w:rFonts w:ascii="Times New Roman" w:hAnsi="Times New Roman" w:cs="Times New Roman"/>
+        </w:rPr>
+        <w:t xml:space="preserve">you can display information back to the user: alert(), confirm(), or a custom-designed </w:t>
+      </w:r>
+      <w:r>
+        <w:rPr>
+          <w:rFonts w:ascii="Times New Roman" w:hAnsi="Times New Roman" w:cs="Times New Roman"/>
+        </w:rPr>
+        <w:t>pop-up. With alert</w:t>
+      </w:r>
+      <w:r>
+        <w:rPr>
+          <w:rFonts w:ascii="Times New Roman" w:hAnsi="Times New Roman" w:cs="Times New Roman"/>
+        </w:rPr>
+        <w:t>()</w:t>
+      </w:r>
+      <w:r>
+        <w:rPr>
+          <w:rFonts w:ascii="Times New Roman" w:hAnsi="Times New Roman" w:cs="Times New Roman"/>
+        </w:rPr>
+        <w:t xml:space="preserve">, you can use </w:t>
+      </w:r>
+      <w:r>
+        <w:rPr>
+          <w:rFonts w:ascii="Times New Roman" w:hAnsi="Times New Roman" w:cs="Times New Roman"/>
+        </w:rPr>
+        <w:t xml:space="preserve">template literals to insert variable values into </w:t>
+      </w:r>
+      <w:r>
+        <w:rPr>
+          <w:rFonts w:ascii="Times New Roman" w:hAnsi="Times New Roman" w:cs="Times New Roman"/>
+        </w:rPr>
+        <w:t>the displayed text</w:t>
+      </w:r>
+      <w:r>
+        <w:rPr>
+          <w:rFonts w:ascii="Times New Roman" w:hAnsi="Times New Roman" w:cs="Times New Roman"/>
+        </w:rPr>
+        <w:t xml:space="preserve"> with backticks.</w:t>
+      </w:r>
+    </w:p>
+    <w:p>
+      <w:pPr>
+        <w:spacing w:line="480" w:lineRule="auto"/>
+        <w:rPr>
+          <w:rFonts w:ascii="Times New Roman" w:hAnsi="Times New Roman" w:cs="Times New Roman"/>
+        </w:rPr>
+      </w:pPr>
+      <w:r>
+        <w:rPr>
+          <w:rFonts w:ascii="Times New Roman" w:hAnsi="Times New Roman" w:cs="Times New Roman"/>
+          <w:b/>
+          <w:bCs/>
+        </w:rPr>
+        <w:t>How was the response used (directly, modified, discarded)? Explain.</w:t>
+      </w:r>
+      <w:r>
+        <w:rPr>
+          <w:rFonts w:ascii="Times New Roman" w:hAnsi="Times New Roman" w:cs="Times New Roman"/>
+          <w:b/>
+          <w:bCs/>
+        </w:rPr>
+        <w:t xml:space="preserve"> </w:t>
+      </w:r>
+      <w:r>
+        <w:rPr>
+          <w:rFonts w:ascii="Times New Roman" w:hAnsi="Times New Roman" w:cs="Times New Roman"/>
+        </w:rPr>
+        <w:t xml:space="preserve">I used this response to create the alert display after an appropriate submission. </w:t>
+      </w:r>
+    </w:p>
+    <w:p>
+      <w:pPr>
+        <w:spacing w:line="480" w:lineRule="auto"/>
+        <w:rPr>
+          <w:rFonts w:ascii="Times New Roman" w:hAnsi="Times New Roman" w:cs="Times New Roman"/>
+          <w:b/>
+          <w:bCs/>
+        </w:rPr>
+      </w:pPr>
+    </w:p>
+    <w:p>
+      <w:pPr>
+        <w:spacing w:line="480" w:lineRule="auto"/>
+        <w:rPr>
+          <w:rFonts w:ascii="Times New Roman" w:hAnsi="Times New Roman" w:cs="Times New Roman"/>
+          <w:b/>
+          <w:bCs/>
+        </w:rPr>
+      </w:pPr>
+    </w:p>
+    <w:p>
+      <w:pPr>
+        <w:spacing w:line="480" w:lineRule="auto"/>
+        <w:rPr>
+          <w:rFonts w:ascii="Times New Roman" w:hAnsi="Times New Roman" w:cs="Times New Roman"/>
+        </w:rPr>
+      </w:pPr>
+    </w:p>
+    <w:p>
+      <w:pPr>
+        <w:spacing w:line="480" w:lineRule="auto"/>
+        <w:rPr>
+          <w:rFonts w:ascii="Times New Roman" w:hAnsi="Times New Roman" w:cs="Times New Roman"/>
+        </w:rPr>
+      </w:pPr>
+    </w:p>
+    <w:p>
+      <w:pPr>
+        <w:spacing w:line="480" w:lineRule="auto"/>
+        <w:rPr>
+          <w:rFonts w:ascii="Times New Roman" w:hAnsi="Times New Roman" w:cs="Times New Roman"/>
+        </w:rPr>
+      </w:pPr>
     </w:p>
     <w:p/>
     <w:sectPr>
@@ -840,7 +2404,6 @@
   <w:style w:type="character" w:default="1" w:styleId="DefaultParagraphFont">
     <w:name w:val="Default Paragraph Font"/>
     <w:uiPriority w:val="1"/>
-    <w:semiHidden/>
     <w:unhideWhenUsed/>
   </w:style>
   <w:style w:type="table" w:default="1" w:styleId="TableNormal">

</xml_diff>

<commit_message>
Fix pop-up display and update AI report
</commit_message>
<xml_diff>
--- a/Files (Module One and Two)/ModuleTwo-Specific Files/Module Two Shared AI Usage Report.docx
+++ b/Files (Module One and Two)/ModuleTwo-Specific Files/Module Two Shared AI Usage Report.docx
@@ -458,21 +458,7 @@
         <w:rPr>
           <w:rFonts w:ascii="Times New Roman" w:hAnsi="Times New Roman" w:cs="Times New Roman"/>
         </w:rPr>
-        <w:t xml:space="preserve">Use console.log() statements and </w:t>
-      </w:r>
-      <w:proofErr w:type="spellStart"/>
-      <w:r>
-        <w:rPr>
-          <w:rFonts w:ascii="Times New Roman" w:hAnsi="Times New Roman" w:cs="Times New Roman"/>
-        </w:rPr>
-        <w:t>e.preventDefault</w:t>
-      </w:r>
-      <w:proofErr w:type="spellEnd"/>
-      <w:r>
-        <w:rPr>
-          <w:rFonts w:ascii="Times New Roman" w:hAnsi="Times New Roman" w:cs="Times New Roman"/>
-        </w:rPr>
-        <w:t>() to simulate a submission.</w:t>
+        <w:t>Use console.log() statements and e.preventDefault() to simulate a submission.</w:t>
       </w:r>
     </w:p>
     <w:p>
@@ -578,21 +564,7 @@
         <w:rPr>
           <w:rFonts w:ascii="Times New Roman" w:hAnsi="Times New Roman" w:cs="Times New Roman"/>
         </w:rPr>
-        <w:t xml:space="preserve">Understanding format of </w:t>
-      </w:r>
-      <w:proofErr w:type="spellStart"/>
-      <w:r>
-        <w:rPr>
-          <w:rFonts w:ascii="Times New Roman" w:hAnsi="Times New Roman" w:cs="Times New Roman"/>
-        </w:rPr>
-        <w:t>RegEx</w:t>
-      </w:r>
-      <w:proofErr w:type="spellEnd"/>
-      <w:r>
-        <w:rPr>
-          <w:rFonts w:ascii="Times New Roman" w:hAnsi="Times New Roman" w:cs="Times New Roman"/>
-        </w:rPr>
-        <w:t xml:space="preserve"> checks in JavaScript</w:t>
+        <w:t>Understanding format of RegEx checks in JavaScript</w:t>
       </w:r>
     </w:p>
     <w:p>
@@ -648,21 +620,7 @@
         <w:rPr>
           <w:rFonts w:ascii="Times New Roman" w:hAnsi="Times New Roman" w:cs="Times New Roman"/>
         </w:rPr>
-        <w:t xml:space="preserve">Help me understand the general format of doing a </w:t>
-      </w:r>
-      <w:proofErr w:type="spellStart"/>
-      <w:r>
-        <w:rPr>
-          <w:rFonts w:ascii="Times New Roman" w:hAnsi="Times New Roman" w:cs="Times New Roman"/>
-        </w:rPr>
-        <w:t>RegEx</w:t>
-      </w:r>
-      <w:proofErr w:type="spellEnd"/>
-      <w:r>
-        <w:rPr>
-          <w:rFonts w:ascii="Times New Roman" w:hAnsi="Times New Roman" w:cs="Times New Roman"/>
-        </w:rPr>
-        <w:t xml:space="preserve"> comparison in JavaScript</w:t>
+        <w:t>Help me understand the general format of doing a RegEx comparison in JavaScript</w:t>
       </w:r>
     </w:p>
     <w:p>
@@ -696,21 +654,7 @@
         <w:rPr>
           <w:rFonts w:ascii="Times New Roman" w:hAnsi="Times New Roman" w:cs="Times New Roman"/>
         </w:rPr>
-        <w:t xml:space="preserve"> </w:t>
-      </w:r>
-      <w:proofErr w:type="spellStart"/>
-      <w:r>
-        <w:rPr>
-          <w:rFonts w:ascii="Times New Roman" w:hAnsi="Times New Roman" w:cs="Times New Roman"/>
-        </w:rPr>
-        <w:t>RegEx</w:t>
-      </w:r>
-      <w:proofErr w:type="spellEnd"/>
-      <w:r>
-        <w:rPr>
-          <w:rFonts w:ascii="Times New Roman" w:hAnsi="Times New Roman" w:cs="Times New Roman"/>
-        </w:rPr>
-        <w:t xml:space="preserve">: using test() and using match(). </w:t>
+        <w:t xml:space="preserve"> RegEx: using test() and using match(). </w:t>
       </w:r>
       <w:r>
         <w:rPr>
@@ -752,21 +696,7 @@
         <w:rPr>
           <w:rFonts w:ascii="Times New Roman" w:hAnsi="Times New Roman" w:cs="Times New Roman"/>
         </w:rPr>
-        <w:t xml:space="preserve">I used the test() method within if statements to check if the inputted value for a field matched the </w:t>
-      </w:r>
-      <w:proofErr w:type="spellStart"/>
-      <w:r>
-        <w:rPr>
-          <w:rFonts w:ascii="Times New Roman" w:hAnsi="Times New Roman" w:cs="Times New Roman"/>
-        </w:rPr>
-        <w:t>RegEx</w:t>
-      </w:r>
-      <w:proofErr w:type="spellEnd"/>
-      <w:r>
-        <w:rPr>
-          <w:rFonts w:ascii="Times New Roman" w:hAnsi="Times New Roman" w:cs="Times New Roman"/>
-        </w:rPr>
-        <w:t xml:space="preserve"> pattern I defined.</w:t>
+        <w:t>I used the test() method within if statements to check if the inputted value for a field matched the RegEx pattern I defined.</w:t>
       </w:r>
     </w:p>
     <w:p>
@@ -834,16 +764,8 @@
         <w:rPr>
           <w:rFonts w:ascii="Times New Roman" w:hAnsi="Times New Roman" w:cs="Times New Roman"/>
         </w:rPr>
-        <w:t xml:space="preserve">Understand </w:t>
-      </w:r>
-      <w:proofErr w:type="spellStart"/>
-      <w:r>
-        <w:rPr>
-          <w:rFonts w:ascii="Times New Roman" w:hAnsi="Times New Roman" w:cs="Times New Roman"/>
-        </w:rPr>
-        <w:t>RegEx</w:t>
-      </w:r>
-      <w:proofErr w:type="spellEnd"/>
+        <w:t>Understand RegEx</w:t>
+      </w:r>
     </w:p>
     <w:p>
       <w:pPr>
@@ -898,35 +820,7 @@
         <w:rPr>
           <w:rFonts w:ascii="Times New Roman" w:hAnsi="Times New Roman" w:cs="Times New Roman"/>
         </w:rPr>
-        <w:t xml:space="preserve">lp me correct this </w:t>
-      </w:r>
-      <w:proofErr w:type="spellStart"/>
-      <w:r>
-        <w:rPr>
-          <w:rFonts w:ascii="Times New Roman" w:hAnsi="Times New Roman" w:cs="Times New Roman"/>
-        </w:rPr>
-        <w:t>RegEx</w:t>
-      </w:r>
-      <w:proofErr w:type="spellEnd"/>
-      <w:r>
-        <w:rPr>
-          <w:rFonts w:ascii="Times New Roman" w:hAnsi="Times New Roman" w:cs="Times New Roman"/>
-        </w:rPr>
-        <w:t xml:space="preserve"> expression (help me adjust my thinking so I can conceptualize these better moving forward). It is supposed to ensure that the input is exactly 4 digits and is no less than "2026". This was my attempt at the </w:t>
-      </w:r>
-      <w:proofErr w:type="spellStart"/>
-      <w:r>
-        <w:rPr>
-          <w:rFonts w:ascii="Times New Roman" w:hAnsi="Times New Roman" w:cs="Times New Roman"/>
-        </w:rPr>
-        <w:t>RegEx</w:t>
-      </w:r>
-      <w:proofErr w:type="spellEnd"/>
-      <w:r>
-        <w:rPr>
-          <w:rFonts w:ascii="Times New Roman" w:hAnsi="Times New Roman" w:cs="Times New Roman"/>
-        </w:rPr>
-        <w:t>: '2[0-9][2-9][0-9]{4}'</w:t>
+        <w:t>lp me correct this RegEx expression (help me adjust my thinking so I can conceptualize these better moving forward). It is supposed to ensure that the input is exactly 4 digits and is no less than "2026". This was my attempt at the RegEx: '2[0-9][2-9][0-9]{4}'</w:t>
       </w:r>
     </w:p>
     <w:p>
@@ -954,21 +848,7 @@
         <w:rPr>
           <w:rFonts w:ascii="Times New Roman" w:hAnsi="Times New Roman" w:cs="Times New Roman"/>
         </w:rPr>
-        <w:t xml:space="preserve">It is better to think of these types of </w:t>
-      </w:r>
-      <w:proofErr w:type="spellStart"/>
-      <w:r>
-        <w:rPr>
-          <w:rFonts w:ascii="Times New Roman" w:hAnsi="Times New Roman" w:cs="Times New Roman"/>
-        </w:rPr>
-        <w:t>RegEx</w:t>
-      </w:r>
-      <w:proofErr w:type="spellEnd"/>
-      <w:r>
-        <w:rPr>
-          <w:rFonts w:ascii="Times New Roman" w:hAnsi="Times New Roman" w:cs="Times New Roman"/>
-        </w:rPr>
-        <w:t xml:space="preserve"> as possible patterns. For example, if the first value </w:t>
+        <w:t xml:space="preserve">It is better to think of these types of RegEx as possible patterns. For example, if the first value </w:t>
       </w:r>
       <w:r>
         <w:rPr>
@@ -1194,21 +1074,7 @@
         <w:rPr>
           <w:rFonts w:ascii="Times New Roman" w:hAnsi="Times New Roman" w:cs="Times New Roman"/>
         </w:rPr>
-        <w:t xml:space="preserve">I included a Boolean variable at the beginning of my </w:t>
-      </w:r>
-      <w:proofErr w:type="spellStart"/>
-      <w:r>
-        <w:rPr>
-          <w:rFonts w:ascii="Times New Roman" w:hAnsi="Times New Roman" w:cs="Times New Roman"/>
-        </w:rPr>
-        <w:t>addCourse</w:t>
-      </w:r>
-      <w:proofErr w:type="spellEnd"/>
-      <w:r>
-        <w:rPr>
-          <w:rFonts w:ascii="Times New Roman" w:hAnsi="Times New Roman" w:cs="Times New Roman"/>
-        </w:rPr>
-        <w:t xml:space="preserve"> validation </w:t>
+        <w:t xml:space="preserve">I included a Boolean variable at the beginning of my addCourse validation </w:t>
       </w:r>
       <w:r>
         <w:rPr>
@@ -1226,21 +1092,7 @@
         <w:rPr>
           <w:rFonts w:ascii="Times New Roman" w:hAnsi="Times New Roman" w:cs="Times New Roman"/>
         </w:rPr>
-        <w:t xml:space="preserve">or the input doesn’t match the </w:t>
-      </w:r>
-      <w:proofErr w:type="spellStart"/>
-      <w:r>
-        <w:rPr>
-          <w:rFonts w:ascii="Times New Roman" w:hAnsi="Times New Roman" w:cs="Times New Roman"/>
-        </w:rPr>
-        <w:t>RegEx</w:t>
-      </w:r>
-      <w:proofErr w:type="spellEnd"/>
-      <w:r>
-        <w:rPr>
-          <w:rFonts w:ascii="Times New Roman" w:hAnsi="Times New Roman" w:cs="Times New Roman"/>
-        </w:rPr>
-        <w:t>), the submission is prevented. If the Boolean never gets changed to false, then logic for a valid submission is executed.</w:t>
+        <w:t>or the input doesn’t match the RegEx), the submission is prevented. If the Boolean never gets changed to false, then logic for a valid submission is executed.</w:t>
       </w:r>
     </w:p>
     <w:p>
@@ -1308,21 +1160,7 @@
         <w:rPr>
           <w:rFonts w:ascii="Times New Roman" w:hAnsi="Times New Roman" w:cs="Times New Roman"/>
         </w:rPr>
-        <w:t xml:space="preserve">Edit </w:t>
-      </w:r>
-      <w:proofErr w:type="spellStart"/>
-      <w:r>
-        <w:rPr>
-          <w:rFonts w:ascii="Times New Roman" w:hAnsi="Times New Roman" w:cs="Times New Roman"/>
-        </w:rPr>
-        <w:t>RegEx</w:t>
-      </w:r>
-      <w:proofErr w:type="spellEnd"/>
-      <w:r>
-        <w:rPr>
-          <w:rFonts w:ascii="Times New Roman" w:hAnsi="Times New Roman" w:cs="Times New Roman"/>
-        </w:rPr>
-        <w:t xml:space="preserve"> expression</w:t>
+        <w:t>Edit RegEx expression</w:t>
       </w:r>
     </w:p>
     <w:p>
@@ -1372,21 +1210,7 @@
         <w:rPr>
           <w:rFonts w:ascii="Times New Roman" w:hAnsi="Times New Roman" w:cs="Times New Roman"/>
         </w:rPr>
-        <w:t xml:space="preserve">Help me edit this </w:t>
-      </w:r>
-      <w:proofErr w:type="spellStart"/>
-      <w:r>
-        <w:rPr>
-          <w:rFonts w:ascii="Times New Roman" w:hAnsi="Times New Roman" w:cs="Times New Roman"/>
-        </w:rPr>
-        <w:t>RegEx</w:t>
-      </w:r>
-      <w:proofErr w:type="spellEnd"/>
-      <w:r>
-        <w:rPr>
-          <w:rFonts w:ascii="Times New Roman" w:hAnsi="Times New Roman" w:cs="Times New Roman"/>
-        </w:rPr>
-        <w:t xml:space="preserve"> expression (</w:t>
+        <w:t>Help me edit this RegEx expression (</w:t>
       </w:r>
       <w:r>
         <w:rPr>
@@ -1400,35 +1224,7 @@
         <w:rPr>
           <w:rFonts w:ascii="Times New Roman" w:hAnsi="Times New Roman" w:cs="Times New Roman"/>
         </w:rPr>
-        <w:t xml:space="preserve"> </w:t>
-      </w:r>
-      <w:proofErr w:type="spellStart"/>
-      <w:r>
-        <w:rPr>
-          <w:rFonts w:ascii="Times New Roman" w:hAnsi="Times New Roman" w:cs="Times New Roman"/>
-        </w:rPr>
-        <w:t>roomRegEx</w:t>
-      </w:r>
-      <w:proofErr w:type="spellEnd"/>
-      <w:r>
-        <w:rPr>
-          <w:rFonts w:ascii="Times New Roman" w:hAnsi="Times New Roman" w:cs="Times New Roman"/>
-        </w:rPr>
-        <w:t xml:space="preserve"> = /^[A-Za-z'\s]\d[0-9]{2,3}\s{0,1}[a-</w:t>
-      </w:r>
-      <w:proofErr w:type="spellStart"/>
-      <w:r>
-        <w:rPr>
-          <w:rFonts w:ascii="Times New Roman" w:hAnsi="Times New Roman" w:cs="Times New Roman"/>
-        </w:rPr>
-        <w:t>zA</w:t>
-      </w:r>
-      <w:proofErr w:type="spellEnd"/>
-      <w:r>
-        <w:rPr>
-          <w:rFonts w:ascii="Times New Roman" w:hAnsi="Times New Roman" w:cs="Times New Roman"/>
-        </w:rPr>
-        <w:t>-z]{0,1}$/;) to fit this description: Must be formatted as a building name and room number. The building name will be a string</w:t>
+        <w:t xml:space="preserve"> roomRegEx = /^[A-Za-z'\s]\d[0-9]{2,3}\s{0,1}[a-zA-z]{0,1}$/;) to fit this description: Must be formatted as a building name and room number. The building name will be a string</w:t>
       </w:r>
       <w:r>
         <w:rPr>
@@ -1470,21 +1266,7 @@
         <w:rPr>
           <w:rFonts w:ascii="Times New Roman" w:hAnsi="Times New Roman" w:cs="Times New Roman"/>
         </w:rPr>
-        <w:t xml:space="preserve">I was given an updated </w:t>
-      </w:r>
-      <w:proofErr w:type="spellStart"/>
-      <w:r>
-        <w:rPr>
-          <w:rFonts w:ascii="Times New Roman" w:hAnsi="Times New Roman" w:cs="Times New Roman"/>
-        </w:rPr>
-        <w:t>RegEx</w:t>
-      </w:r>
-      <w:proofErr w:type="spellEnd"/>
-      <w:r>
-        <w:rPr>
-          <w:rFonts w:ascii="Times New Roman" w:hAnsi="Times New Roman" w:cs="Times New Roman"/>
-        </w:rPr>
-        <w:t xml:space="preserve"> and a description of each part of the statement.</w:t>
+        <w:t>I was given an updated RegEx and a description of each part of the statement.</w:t>
       </w:r>
     </w:p>
     <w:p>
@@ -1743,6 +1525,228 @@
           <w:rFonts w:ascii="Times New Roman" w:hAnsi="Times New Roman" w:cs="Times New Roman"/>
         </w:rPr>
         <w:t xml:space="preserve">I used this response to create the alert display after an appropriate submission. </w:t>
+      </w:r>
+    </w:p>
+    <w:p>
+      <w:pPr>
+        <w:rPr>
+          <w:rFonts w:ascii="Times New Roman" w:hAnsi="Times New Roman" w:cs="Times New Roman"/>
+        </w:rPr>
+      </w:pPr>
+      <w:r>
+        <w:rPr>
+          <w:rFonts w:ascii="Times New Roman" w:hAnsi="Times New Roman" w:cs="Times New Roman"/>
+        </w:rPr>
+        <w:br w:type="page"/>
+      </w:r>
+    </w:p>
+    <w:p>
+      <w:pPr>
+        <w:spacing w:line="480" w:lineRule="auto"/>
+        <w:rPr>
+          <w:rFonts w:ascii="Times New Roman" w:hAnsi="Times New Roman" w:cs="Times New Roman"/>
+        </w:rPr>
+      </w:pPr>
+      <w:r>
+        <w:rPr>
+          <w:rFonts w:ascii="Times New Roman" w:hAnsi="Times New Roman" w:cs="Times New Roman"/>
+          <w:b/>
+          <w:bCs/>
+        </w:rPr>
+        <w:lastRenderedPageBreak/>
+        <w:t>AI Tool used:</w:t>
+      </w:r>
+      <w:r>
+        <w:rPr>
+          <w:rFonts w:ascii="Times New Roman" w:hAnsi="Times New Roman" w:cs="Times New Roman"/>
+        </w:rPr>
+        <w:t xml:space="preserve"> ChatGPT</w:t>
+      </w:r>
+    </w:p>
+    <w:p>
+      <w:pPr>
+        <w:spacing w:line="480" w:lineRule="auto"/>
+        <w:rPr>
+          <w:rFonts w:ascii="Times New Roman" w:hAnsi="Times New Roman" w:cs="Times New Roman"/>
+        </w:rPr>
+      </w:pPr>
+      <w:r>
+        <w:rPr>
+          <w:rFonts w:ascii="Times New Roman" w:hAnsi="Times New Roman" w:cs="Times New Roman"/>
+          <w:b/>
+          <w:bCs/>
+        </w:rPr>
+        <w:t>Task being performed:</w:t>
+      </w:r>
+      <w:r>
+        <w:rPr>
+          <w:rFonts w:ascii="Times New Roman" w:hAnsi="Times New Roman" w:cs="Times New Roman"/>
+        </w:rPr>
+        <w:t xml:space="preserve"> </w:t>
+      </w:r>
+      <w:r>
+        <w:rPr>
+          <w:rFonts w:ascii="Times New Roman" w:hAnsi="Times New Roman" w:cs="Times New Roman"/>
+        </w:rPr>
+        <w:t xml:space="preserve">Display correct time based on </w:t>
+      </w:r>
+      <w:r>
+        <w:rPr>
+          <w:rFonts w:ascii="Times New Roman" w:hAnsi="Times New Roman" w:cs="Times New Roman"/>
+        </w:rPr>
+        <w:t>visible select list</w:t>
+      </w:r>
+    </w:p>
+    <w:p>
+      <w:pPr>
+        <w:spacing w:line="480" w:lineRule="auto"/>
+        <w:rPr>
+          <w:rFonts w:ascii="Times New Roman" w:hAnsi="Times New Roman" w:cs="Times New Roman"/>
+        </w:rPr>
+      </w:pPr>
+      <w:r>
+        <w:rPr>
+          <w:rFonts w:ascii="Times New Roman" w:hAnsi="Times New Roman" w:cs="Times New Roman"/>
+          <w:b/>
+          <w:bCs/>
+        </w:rPr>
+        <w:t>File associated with task:</w:t>
+      </w:r>
+      <w:r>
+        <w:rPr>
+          <w:rFonts w:ascii="Times New Roman" w:hAnsi="Times New Roman" w:cs="Times New Roman"/>
+        </w:rPr>
+        <w:t xml:space="preserve"> validation.js</w:t>
+      </w:r>
+    </w:p>
+    <w:p>
+      <w:pPr>
+        <w:spacing w:line="480" w:lineRule="auto"/>
+        <w:rPr>
+          <w:rFonts w:ascii="Times New Roman" w:hAnsi="Times New Roman" w:cs="Times New Roman"/>
+        </w:rPr>
+      </w:pPr>
+      <w:r>
+        <w:rPr>
+          <w:rFonts w:ascii="Times New Roman" w:hAnsi="Times New Roman" w:cs="Times New Roman"/>
+          <w:b/>
+          <w:bCs/>
+        </w:rPr>
+        <w:t>Prompt/question provided:</w:t>
+      </w:r>
+      <w:r>
+        <w:rPr>
+          <w:rFonts w:ascii="Times New Roman" w:hAnsi="Times New Roman" w:cs="Times New Roman"/>
+        </w:rPr>
+        <w:t xml:space="preserve"> </w:t>
+      </w:r>
+      <w:r>
+        <w:rPr>
+          <w:rFonts w:ascii="Times New Roman" w:hAnsi="Times New Roman" w:cs="Times New Roman"/>
+        </w:rPr>
+        <w:t xml:space="preserve">How can I display the </w:t>
+      </w:r>
+      <w:r>
+        <w:rPr>
+          <w:rFonts w:ascii="Times New Roman" w:hAnsi="Times New Roman" w:cs="Times New Roman"/>
+        </w:rPr>
+        <w:t>selected time based on the list that is actually shown?</w:t>
+      </w:r>
+    </w:p>
+    <w:p>
+      <w:pPr>
+        <w:spacing w:line="480" w:lineRule="auto"/>
+        <w:rPr>
+          <w:rFonts w:ascii="Times New Roman" w:hAnsi="Times New Roman" w:cs="Times New Roman"/>
+        </w:rPr>
+      </w:pPr>
+      <w:r>
+        <w:rPr>
+          <w:rFonts w:ascii="Times New Roman" w:hAnsi="Times New Roman" w:cs="Times New Roman"/>
+          <w:b/>
+          <w:bCs/>
+        </w:rPr>
+        <w:t>Summary of the response</w:t>
+      </w:r>
+      <w:r>
+        <w:rPr>
+          <w:rFonts w:ascii="Times New Roman" w:hAnsi="Times New Roman" w:cs="Times New Roman"/>
+          <w:b/>
+          <w:bCs/>
+        </w:rPr>
+        <w:t xml:space="preserve">: </w:t>
+      </w:r>
+      <w:r>
+        <w:rPr>
+          <w:rFonts w:ascii="Times New Roman" w:hAnsi="Times New Roman" w:cs="Times New Roman"/>
+        </w:rPr>
+        <w:t xml:space="preserve">Use a </w:t>
+      </w:r>
+      <w:r>
+        <w:rPr>
+          <w:rFonts w:ascii="Times New Roman" w:hAnsi="Times New Roman" w:cs="Times New Roman"/>
+        </w:rPr>
+        <w:t xml:space="preserve">modifiable variable (define it with let instead of const) to hold the value of the time you want to display. Then, use an if-else block to </w:t>
+      </w:r>
+      <w:r>
+        <w:rPr>
+          <w:rFonts w:ascii="Times New Roman" w:hAnsi="Times New Roman" w:cs="Times New Roman"/>
+        </w:rPr>
+        <w:t>check which dropdown list is visible</w:t>
+      </w:r>
+      <w:r>
+        <w:rPr>
+          <w:rFonts w:ascii="Times New Roman" w:hAnsi="Times New Roman" w:cs="Times New Roman"/>
+        </w:rPr>
+        <w:t xml:space="preserve">, and within each block, </w:t>
+      </w:r>
+      <w:r>
+        <w:rPr>
+          <w:rFonts w:ascii="Times New Roman" w:hAnsi="Times New Roman" w:cs="Times New Roman"/>
+        </w:rPr>
+        <w:t xml:space="preserve">set the pre-defined variable </w:t>
+      </w:r>
+      <w:r>
+        <w:rPr>
+          <w:rFonts w:ascii="Times New Roman" w:hAnsi="Times New Roman" w:cs="Times New Roman"/>
+        </w:rPr>
+        <w:t xml:space="preserve">to the value of the </w:t>
+      </w:r>
+      <w:r>
+        <w:rPr>
+          <w:rFonts w:ascii="Times New Roman" w:hAnsi="Times New Roman" w:cs="Times New Roman"/>
+        </w:rPr>
+        <w:t>respective dropdown.</w:t>
+      </w:r>
+    </w:p>
+    <w:p>
+      <w:pPr>
+        <w:spacing w:line="480" w:lineRule="auto"/>
+        <w:rPr>
+          <w:rFonts w:ascii="Times New Roman" w:hAnsi="Times New Roman" w:cs="Times New Roman"/>
+        </w:rPr>
+      </w:pPr>
+      <w:r>
+        <w:rPr>
+          <w:rFonts w:ascii="Times New Roman" w:hAnsi="Times New Roman" w:cs="Times New Roman"/>
+          <w:b/>
+          <w:bCs/>
+        </w:rPr>
+        <w:t>How was the response used (directly, modified, discarded)? Explain.</w:t>
+      </w:r>
+      <w:r>
+        <w:rPr>
+          <w:rFonts w:ascii="Times New Roman" w:hAnsi="Times New Roman" w:cs="Times New Roman"/>
+          <w:b/>
+          <w:bCs/>
+        </w:rPr>
+        <w:t xml:space="preserve"> </w:t>
+      </w:r>
+      <w:r>
+        <w:rPr>
+          <w:rFonts w:ascii="Times New Roman" w:hAnsi="Times New Roman" w:cs="Times New Roman"/>
+        </w:rPr>
+        <w:t>I used these guidelines to create my code and fix the display pop-up.</w:t>
       </w:r>
     </w:p>
     <w:p>
@@ -2404,6 +2408,7 @@
   <w:style w:type="character" w:default="1" w:styleId="DefaultParagraphFont">
     <w:name w:val="Default Paragraph Font"/>
     <w:uiPriority w:val="1"/>
+    <w:semiHidden/>
     <w:unhideWhenUsed/>
   </w:style>
   <w:style w:type="table" w:default="1" w:styleId="TableNormal">

</xml_diff>